<commit_message>
Fix stale Autodidacte references after Cartable access change
- CartablePage access-denied message no longer lists Autodidacte
- Terms of use plan descriptions updated (Autodidacte no longer "tout Pro +")
- Regenerated legal .docx files
- Commit pending deletion of root DOCUMENTATION.md (moved to LearnI_Document)

Co-Authored-By: Claude Sonnet 5 <noreply@anthropic.com>
</commit_message>
<xml_diff>
--- a/documents-legaux/LearnI_Conditions_Utilisation.docx
+++ b/documents-legaux/LearnI_Conditions_Utilisation.docx
@@ -101,7 +101,7 @@
         </w:rPr>
         <w:t xml:space="preserve">En accédant à la plateforme </w:t>
       </w:r>
-      <w:hyperlink w:history="1" r:id="rIdadcndah9jsrxqygnpu4q5">
+      <w:hyperlink w:history="1" r:id="rIddvan7bekee08xnxecahf1">
         <w:r>
           <w:rPr>
             <w:rStyle w:val="Hyperlink"/>
@@ -427,7 +427,7 @@
         </w:rPr>
         <w:t xml:space="preserve">Veuillez nous contacter immédiatement à </w:t>
       </w:r>
-      <w:hyperlink w:history="1" r:id="rIdpdeiyf0vng7sk4wmtnwqi">
+      <w:hyperlink w:history="1" r:id="rIddp0mxsnrldccgrd9ffddp">
         <w:r>
           <w:rPr>
             <w:rStyle w:val="Hyperlink"/>
@@ -545,25 +545,25 @@
           <w:sz w:val="22"/>
           <w:szCs w:val="22"/>
         </w:rPr>
-        <w:t xml:space="preserve">Pro — 22,99 $/mois — quiz illimités, toutes les fonctionnalités de révision</w:t>
-      </w:r>
-    </w:p>
-    <w:p>
-      <w:pPr>
-        <w:pStyle w:val="ListParagraph"/>
-        <w:numPr>
-          <w:ilvl w:val="0"/>
-          <w:numId w:val="2"/>
-        </w:numPr>
-        <w:spacing w:after="80"/>
-      </w:pPr>
-      <w:r>
-        <w:rPr>
-          <w:rFonts w:ascii="Arial" w:cs="Arial" w:eastAsia="Arial" w:hAnsi="Arial"/>
-          <w:sz w:val="22"/>
-          <w:szCs w:val="22"/>
-        </w:rPr>
-        <w:t xml:space="preserve">Autodidacte — 35,99 $/mois — tout Pro + tuteur IA, cours et plan d'étude</w:t>
+        <w:t xml:space="preserve">Pro — 22,99 $/mois — quiz illimités, flashcards, plan d'étude avec agenda, Mon Cartable</w:t>
+      </w:r>
+    </w:p>
+    <w:p>
+      <w:pPr>
+        <w:pStyle w:val="ListParagraph"/>
+        <w:numPr>
+          <w:ilvl w:val="0"/>
+          <w:numId w:val="2"/>
+        </w:numPr>
+        <w:spacing w:after="80"/>
+      </w:pPr>
+      <w:r>
+        <w:rPr>
+          <w:rFonts w:ascii="Arial" w:cs="Arial" w:eastAsia="Arial" w:hAnsi="Arial"/>
+          <w:sz w:val="22"/>
+          <w:szCs w:val="22"/>
+        </w:rPr>
+        <w:t xml:space="preserve">Autodidacte — 35,99 $/mois — quiz illimités, flashcards, plan d'étude avec agenda, tuteur IA, cours générés par l'IA, communautés</w:t>
       </w:r>
     </w:p>
     <w:p>
@@ -1197,7 +1197,7 @@
         </w:rPr>
         <w:t xml:space="preserve">Pour toute question concernant ces Conditions d'utilisation, veuillez nous contacter à : </w:t>
       </w:r>
-      <w:hyperlink w:history="1" r:id="rIdbcgr68gpbciklxwg_kkte">
+      <w:hyperlink w:history="1" r:id="rIdutqtvr66rgcyshlgfh8dm">
         <w:r>
           <w:rPr>
             <w:rStyle w:val="Hyperlink"/>

</xml_diff>